<commit_message>
Document Microsoft Graph as the only mail provider
Co-Authored-By: Claude Opus 5 (1M context) <noreply@anthropic.com>
Claude-Session: https://claude.ai/code/session_01NtXEr3cBGDqXwFLmPnFVye
</commit_message>
<xml_diff>
--- a/docs/DSR Portal - Developer Handbook.docx
+++ b/docs/DSR Portal - Developer Handbook.docx
@@ -55,7 +55,7 @@
           <w:color w:val="8A8A85"/>
           <w:sz w:val="18"/>
         </w:rPr>
-        <w:t>Version 1.0  ·  20 August 2026</w:t>
+        <w:t>Version 1.0  ·  29 August 2026</w:t>
       </w:r>
     </w:p>
     <w:p>
@@ -2452,7 +2452,7 @@
               <w:rPr>
                 <w:sz w:val="18"/>
               </w:rPr>
-              <w:t>, which resolves the active adapter per call so providers can be switched at runtime.</w:t>
+              <w:t>, which resolves the active adapter per call. Provider choice itself is environment-only (see 4.3).</w:t>
             </w:r>
           </w:p>
         </w:tc>
@@ -2474,7 +2474,7 @@
                 <w:color w:val="6F5900"/>
                 <w:sz w:val="18"/>
               </w:rPr>
-              <w:t>smtp.ts</w:t>
+              <w:t>net-diagnostics.ts</w:t>
             </w:r>
           </w:p>
         </w:tc>
@@ -2492,7 +2492,7 @@
               <w:rPr>
                 <w:sz w:val="18"/>
               </w:rPr>
-              <w:t>Shared SMTP transport with IPv4 pinning and timeouts, plus the staged diagnostic.</w:t>
+              <w:t>Shared HTTPS reachability probe (DNS, TCP) with IPv4 pinning and timeouts, plus the staged diagnostic.</w:t>
             </w:r>
           </w:p>
         </w:tc>
@@ -2514,7 +2514,7 @@
                 <w:color w:val="6F5900"/>
                 <w:sz w:val="18"/>
               </w:rPr>
-              <w:t>gmail.provider.ts</w:t>
+              <w:t>graph.provider.ts</w:t>
             </w:r>
           </w:p>
         </w:tc>
@@ -2532,7 +2532,7 @@
               <w:rPr>
                 <w:sz w:val="18"/>
               </w:rPr>
-              <w:t>Gmail over SMTP app password or the Gmail API with OAuth2. Only the API path works on this host.</w:t>
+              <w:t>Microsoft Graph, sending as a shared mailbox. The only production adapter.</w:t>
             </w:r>
           </w:p>
         </w:tc>
@@ -2554,7 +2554,7 @@
                 <w:color w:val="6F5900"/>
                 <w:sz w:val="18"/>
               </w:rPr>
-              <w:t>smtp.provider.ts</w:t>
+              <w:t>console.provider.ts</w:t>
             </w:r>
           </w:p>
         </w:tc>
@@ -2572,7 +2572,21 @@
               <w:rPr>
                 <w:sz w:val="18"/>
               </w:rPr>
-              <w:t>Any SMTP server.</w:t>
+              <w:t xml:space="preserve">Development adapter that writes to the log. Refused in production unless </w:t>
+            </w:r>
+            <w:r>
+              <w:rPr>
+                <w:rFonts w:ascii="Consolas" w:hAnsi="Consolas"/>
+                <w:color w:val="6F5900"/>
+                <w:sz w:val="18"/>
+              </w:rPr>
+              <w:t>ALLOW_CONSOLE_EMAIL=true</w:t>
+            </w:r>
+            <w:r>
+              <w:rPr>
+                <w:sz w:val="18"/>
+              </w:rPr>
+              <w:t>.</w:t>
             </w:r>
           </w:p>
         </w:tc>
@@ -2594,7 +2608,7 @@
                 <w:color w:val="6F5900"/>
                 <w:sz w:val="18"/>
               </w:rPr>
-              <w:t>resend.provider.ts</w:t>
+              <w:t>email-config.ts</w:t>
             </w:r>
           </w:p>
         </w:tc>
@@ -2612,21 +2626,7 @@
               <w:rPr>
                 <w:sz w:val="18"/>
               </w:rPr>
-              <w:t>Resend over HTTPS.</w:t>
-            </w:r>
-          </w:p>
-        </w:tc>
-      </w:tr>
-      <w:tr>
-        <w:tc>
-          <w:tcPr>
-            <w:tcW w:type="dxa" w:w="2448"/>
-          </w:tcPr>
-          <w:p>
-            <w:r>
-              <w:rPr>
-                <w:sz w:val="18"/>
-              </w:rPr>
+              <w:t xml:space="preserve">Pure </w:t>
             </w:r>
             <w:r>
               <w:rPr>
@@ -2634,39 +2634,13 @@
                 <w:color w:val="6F5900"/>
                 <w:sz w:val="18"/>
               </w:rPr>
-              <w:t>graph.provider.ts</w:t>
-            </w:r>
-          </w:p>
-        </w:tc>
-        <w:tc>
-          <w:tcPr>
-            <w:tcW w:type="dxa" w:w="6768"/>
-          </w:tcPr>
-          <w:p>
-            <w:r>
-              <w:rPr>
-                <w:sz w:val="18"/>
-              </w:rPr>
-            </w:r>
-            <w:r>
-              <w:rPr>
-                <w:sz w:val="18"/>
-              </w:rPr>
-              <w:t>Microsoft Graph, sending as a shared mailbox.</w:t>
-            </w:r>
-          </w:p>
-        </w:tc>
-      </w:tr>
-      <w:tr>
-        <w:tc>
-          <w:tcPr>
-            <w:tcW w:type="dxa" w:w="2448"/>
-          </w:tcPr>
-          <w:p>
-            <w:r>
-              <w:rPr>
-                <w:sz w:val="18"/>
-              </w:rPr>
+              <w:t>missingEmailKeys()</w:t>
+            </w:r>
+            <w:r>
+              <w:rPr>
+                <w:sz w:val="18"/>
+              </w:rPr>
+              <w:t>/</w:t>
             </w:r>
             <w:r>
               <w:rPr>
@@ -2674,25 +2648,27 @@
                 <w:color w:val="6F5900"/>
                 <w:sz w:val="18"/>
               </w:rPr>
-              <w:t>console.provider.ts</w:t>
-            </w:r>
-          </w:p>
-        </w:tc>
-        <w:tc>
-          <w:tcPr>
-            <w:tcW w:type="dxa" w:w="6768"/>
-          </w:tcPr>
-          <w:p>
-            <w:r>
-              <w:rPr>
-                <w:sz w:val="18"/>
-              </w:rPr>
-            </w:r>
-            <w:r>
-              <w:rPr>
-                <w:sz w:val="18"/>
-              </w:rPr>
-              <w:t>Development adapter that writes to the log. Refused in production.</w:t>
+              <w:t>assertEmailConfig()</w:t>
+            </w:r>
+            <w:r>
+              <w:rPr>
+                <w:sz w:val="18"/>
+              </w:rPr>
+              <w:t xml:space="preserve"> boot-time check: a missing Graph credential stops the service before </w:t>
+            </w:r>
+            <w:r>
+              <w:rPr>
+                <w:rFonts w:ascii="Consolas" w:hAnsi="Consolas"/>
+                <w:color w:val="6F5900"/>
+                <w:sz w:val="18"/>
+              </w:rPr>
+              <w:t>app.listen()</w:t>
+            </w:r>
+            <w:r>
+              <w:rPr>
+                <w:sz w:val="18"/>
+              </w:rPr>
+              <w:t>.</w:t>
             </w:r>
           </w:p>
         </w:tc>
@@ -2824,7 +2800,21 @@
               <w:rPr>
                 <w:sz w:val="18"/>
               </w:rPr>
-              <w:t>Declarative field catalog. Adding an entry here is all it takes to surface a new setting in the UI.</w:t>
+              <w:t xml:space="preserve">Declarative field catalog. Adding an entry here is all it takes to surface a new setting in the UI. The </w:t>
+            </w:r>
+            <w:r>
+              <w:rPr>
+                <w:rFonts w:ascii="Consolas" w:hAnsi="Consolas"/>
+                <w:color w:val="6F5900"/>
+                <w:sz w:val="18"/>
+              </w:rPr>
+              <w:t>envOnly</w:t>
+            </w:r>
+            <w:r>
+              <w:rPr>
+                <w:sz w:val="18"/>
+              </w:rPr>
+              <w:t xml:space="preserve"> flag locks the six email keys to the environment.</w:t>
             </w:r>
           </w:p>
         </w:tc>
@@ -2864,7 +2854,35 @@
               <w:rPr>
                 <w:sz w:val="18"/>
               </w:rPr>
-              <w:t>Resolution order, in-memory cache, encryption of secrets, validation, audit.</w:t>
+              <w:t>Resolution order (</w:t>
+            </w:r>
+            <w:r>
+              <w:rPr>
+                <w:rFonts w:ascii="Consolas" w:hAnsi="Consolas"/>
+                <w:color w:val="6F5900"/>
+                <w:sz w:val="18"/>
+              </w:rPr>
+              <w:t>resolveValue()</w:t>
+            </w:r>
+            <w:r>
+              <w:rPr>
+                <w:sz w:val="18"/>
+              </w:rPr>
+              <w:t xml:space="preserve">), in-memory cache, encryption of secrets, validation, </w:t>
+            </w:r>
+            <w:r>
+              <w:rPr>
+                <w:rFonts w:ascii="Consolas" w:hAnsi="Consolas"/>
+                <w:color w:val="6F5900"/>
+                <w:sz w:val="18"/>
+              </w:rPr>
+              <w:t>envOnly</w:t>
+            </w:r>
+            <w:r>
+              <w:rPr>
+                <w:sz w:val="18"/>
+              </w:rPr>
+              <w:t xml:space="preserve"> write rejection, audit.</w:t>
             </w:r>
           </w:p>
         </w:tc>
@@ -2904,101 +2922,7 @@
               <w:rPr>
                 <w:sz w:val="18"/>
               </w:rPr>
-              <w:t>Super-admin API, connection check, diagnostics, test send, and starting the Gmail authorisation.</w:t>
-            </w:r>
-          </w:p>
-        </w:tc>
-      </w:tr>
-      <w:tr>
-        <w:tc>
-          <w:tcPr>
-            <w:tcW w:type="dxa" w:w="2736"/>
-          </w:tcPr>
-          <w:p>
-            <w:r>
-              <w:rPr>
-                <w:sz w:val="18"/>
-              </w:rPr>
-            </w:r>
-            <w:r>
-              <w:rPr>
-                <w:rFonts w:ascii="Consolas" w:hAnsi="Consolas"/>
-                <w:color w:val="6F5900"/>
-                <w:sz w:val="18"/>
-              </w:rPr>
-              <w:t>settings/gmail-oauth.service.ts</w:t>
-            </w:r>
-          </w:p>
-        </w:tc>
-        <w:tc>
-          <w:tcPr>
-            <w:tcW w:type="dxa" w:w="6480"/>
-          </w:tcPr>
-          <w:p>
-            <w:r>
-              <w:rPr>
-                <w:sz w:val="18"/>
-              </w:rPr>
-            </w:r>
-            <w:r>
-              <w:rPr>
-                <w:sz w:val="18"/>
-              </w:rPr>
-              <w:t xml:space="preserve">The OAuth2 authorisation-code flow: builds the consent URL, holds the pending </w:t>
-            </w:r>
-            <w:r>
-              <w:rPr>
-                <w:rFonts w:ascii="Consolas" w:hAnsi="Consolas"/>
-                <w:color w:val="6F5900"/>
-                <w:sz w:val="18"/>
-              </w:rPr>
-              <w:t>state</w:t>
-            </w:r>
-            <w:r>
-              <w:rPr>
-                <w:sz w:val="18"/>
-              </w:rPr>
-              <w:t>, exchanges the code, stores the refresh token.</w:t>
-            </w:r>
-          </w:p>
-        </w:tc>
-      </w:tr>
-      <w:tr>
-        <w:tc>
-          <w:tcPr>
-            <w:tcW w:type="dxa" w:w="2736"/>
-          </w:tcPr>
-          <w:p>
-            <w:r>
-              <w:rPr>
-                <w:sz w:val="18"/>
-              </w:rPr>
-            </w:r>
-            <w:r>
-              <w:rPr>
-                <w:rFonts w:ascii="Consolas" w:hAnsi="Consolas"/>
-                <w:color w:val="6F5900"/>
-                <w:sz w:val="18"/>
-              </w:rPr>
-              <w:t>settings/gmail-callback.controller.ts</w:t>
-            </w:r>
-          </w:p>
-        </w:tc>
-        <w:tc>
-          <w:tcPr>
-            <w:tcW w:type="dxa" w:w="6480"/>
-          </w:tcPr>
-          <w:p>
-            <w:r>
-              <w:rPr>
-                <w:sz w:val="18"/>
-              </w:rPr>
-            </w:r>
-            <w:r>
-              <w:rPr>
-                <w:sz w:val="18"/>
-              </w:rPr>
-              <w:t>The unauthenticated redirect target Google returns to. Renders the success or failure page.</w:t>
+              <w:t>Super-admin API: catalog + values, update, connection check, diagnostics, test send.</w:t>
             </w:r>
           </w:p>
         </w:tc>
@@ -5632,7 +5556,7 @@
         <w:pStyle w:val="CodeBlock"/>
       </w:pPr>
       <w:r>
-        <w:t xml:space="preserve">             └─ settings.get('EMAIL_PROVIDER')   ← read per call, not at boot</w:t>
+        <w:t xml:space="preserve">             └─ settings.get('EMAIL_PROVIDER')   ← envOnly: env or catalog default, never a DB row</w:t>
       </w:r>
     </w:p>
     <w:p>
@@ -5640,7 +5564,7 @@
         <w:pStyle w:val="CodeBlock"/>
       </w:pPr>
       <w:r>
-        <w:t xml:space="preserve">                  ├─ gmail   → SMTP app password (blocked here) | Gmail API over OAuth2</w:t>
+        <w:t xml:space="preserve">                  ├─ graph   → Microsoft Graph over HTTPS</w:t>
       </w:r>
     </w:p>
     <w:p>
@@ -5648,7 +5572,253 @@
         <w:pStyle w:val="CodeBlock"/>
       </w:pPr>
       <w:r>
-        <w:t xml:space="preserve">                  ├─ smtp    → any SMTP server</w:t>
+        <w:t xml:space="preserve">                  └─ console → log only, refused in production unless ALLOW_CONSOLE_EMAIL=true</w:t>
+      </w:r>
+    </w:p>
+    <w:p>
+      <w:pPr>
+        <w:pStyle w:val="ListBullet"/>
+      </w:pPr>
+      <w:r>
+        <w:t xml:space="preserve">Graph and console are the only adapters. Provider choice and every Graph credential are </w:t>
+      </w:r>
+      <w:r>
+        <w:rPr>
+          <w:rFonts w:ascii="Consolas" w:hAnsi="Consolas"/>
+          <w:color w:val="6F5900"/>
+          <w:sz w:val="18"/>
+        </w:rPr>
+        <w:t>envOnly</w:t>
+      </w:r>
+      <w:r>
+        <w:t xml:space="preserve"> catalog entries (§4.6): </w:t>
+      </w:r>
+      <w:r>
+        <w:rPr>
+          <w:rFonts w:ascii="Consolas" w:hAnsi="Consolas"/>
+          <w:color w:val="6F5900"/>
+          <w:sz w:val="18"/>
+        </w:rPr>
+        <w:t>EMAIL_PROVIDER</w:t>
+      </w:r>
+      <w:r>
+        <w:t xml:space="preserve">, </w:t>
+      </w:r>
+      <w:r>
+        <w:rPr>
+          <w:rFonts w:ascii="Consolas" w:hAnsi="Consolas"/>
+          <w:color w:val="6F5900"/>
+          <w:sz w:val="18"/>
+        </w:rPr>
+        <w:t>EMAIL_FROM_NAME</w:t>
+      </w:r>
+      <w:r>
+        <w:t xml:space="preserve">, </w:t>
+      </w:r>
+      <w:r>
+        <w:rPr>
+          <w:rFonts w:ascii="Consolas" w:hAnsi="Consolas"/>
+          <w:color w:val="6F5900"/>
+          <w:sz w:val="18"/>
+        </w:rPr>
+        <w:t>PRIVACY_MAILBOX</w:t>
+      </w:r>
+      <w:r>
+        <w:t xml:space="preserve">, </w:t>
+      </w:r>
+      <w:r>
+        <w:rPr>
+          <w:rFonts w:ascii="Consolas" w:hAnsi="Consolas"/>
+          <w:color w:val="6F5900"/>
+          <w:sz w:val="18"/>
+        </w:rPr>
+        <w:t>GRAPH_TENANT_ID</w:t>
+      </w:r>
+      <w:r>
+        <w:t xml:space="preserve">, </w:t>
+      </w:r>
+      <w:r>
+        <w:rPr>
+          <w:rFonts w:ascii="Consolas" w:hAnsi="Consolas"/>
+          <w:color w:val="6F5900"/>
+          <w:sz w:val="18"/>
+        </w:rPr>
+        <w:t>GRAPH_CLIENT_ID</w:t>
+      </w:r>
+      <w:r>
+        <w:t xml:space="preserve">, </w:t>
+      </w:r>
+      <w:r>
+        <w:rPr>
+          <w:rFonts w:ascii="Consolas" w:hAnsi="Consolas"/>
+          <w:color w:val="6F5900"/>
+          <w:sz w:val="18"/>
+        </w:rPr>
+        <w:t>GRAPH_CLIENT_SECRET</w:t>
+      </w:r>
+      <w:r>
+        <w:t xml:space="preserve">. A database row can never shadow the value in </w:t>
+      </w:r>
+      <w:r>
+        <w:rPr>
+          <w:rFonts w:ascii="Consolas" w:hAnsi="Consolas"/>
+          <w:color w:val="6F5900"/>
+          <w:sz w:val="18"/>
+        </w:rPr>
+        <w:t>/etc/dsr/dsr-api.env</w:t>
+      </w:r>
+      <w:r>
+        <w:t xml:space="preserve">, and </w:t>
+      </w:r>
+      <w:r>
+        <w:rPr>
+          <w:rFonts w:ascii="Consolas" w:hAnsi="Consolas"/>
+          <w:color w:val="6F5900"/>
+          <w:sz w:val="18"/>
+        </w:rPr>
+        <w:t>PUT /internal/admin/settings</w:t>
+      </w:r>
+      <w:r>
+        <w:t xml:space="preserve"> returns </w:t>
+      </w:r>
+      <w:r>
+        <w:rPr>
+          <w:rFonts w:ascii="Consolas" w:hAnsi="Consolas"/>
+          <w:color w:val="6F5900"/>
+          <w:sz w:val="18"/>
+        </w:rPr>
+        <w:t>400</w:t>
+      </w:r>
+      <w:r>
+        <w:t xml:space="preserve"> for any of the six.</w:t>
+      </w:r>
+    </w:p>
+    <w:p>
+      <w:pPr>
+        <w:pStyle w:val="ListBullet"/>
+      </w:pPr>
+      <w:r>
+        <w:rPr>
+          <w:rFonts w:ascii="Consolas" w:hAnsi="Consolas"/>
+          <w:color w:val="6F5900"/>
+          <w:sz w:val="18"/>
+        </w:rPr>
+        <w:t>assertEmailConfig()</w:t>
+      </w:r>
+      <w:r>
+        <w:t xml:space="preserve"> (</w:t>
+      </w:r>
+      <w:r>
+        <w:rPr>
+          <w:rFonts w:ascii="Consolas" w:hAnsi="Consolas"/>
+          <w:color w:val="6F5900"/>
+          <w:sz w:val="18"/>
+        </w:rPr>
+        <w:t>email-config.ts</w:t>
+      </w:r>
+      <w:r>
+        <w:t xml:space="preserve">) runs in </w:t>
+      </w:r>
+      <w:r>
+        <w:rPr>
+          <w:rFonts w:ascii="Consolas" w:hAnsi="Consolas"/>
+          <w:color w:val="6F5900"/>
+          <w:sz w:val="18"/>
+        </w:rPr>
+        <w:t>main.ts</w:t>
+      </w:r>
+      <w:r>
+        <w:t xml:space="preserve"> before </w:t>
+      </w:r>
+      <w:r>
+        <w:rPr>
+          <w:rFonts w:ascii="Consolas" w:hAnsi="Consolas"/>
+          <w:color w:val="6F5900"/>
+          <w:sz w:val="18"/>
+        </w:rPr>
+        <w:t>app.listen()</w:t>
+      </w:r>
+      <w:r>
+        <w:t xml:space="preserve">. When </w:t>
+      </w:r>
+      <w:r>
+        <w:rPr>
+          <w:rFonts w:ascii="Consolas" w:hAnsi="Consolas"/>
+          <w:color w:val="6F5900"/>
+          <w:sz w:val="18"/>
+        </w:rPr>
+        <w:t>EMAIL_PROVIDER=graph</w:t>
+      </w:r>
+      <w:r>
+        <w:t>, all four required keys must be non-empty or the process exits non-zero, naming every missing key and the env file path in the log.</w:t>
+      </w:r>
+    </w:p>
+    <w:p>
+      <w:pPr>
+        <w:pStyle w:val="ListBullet"/>
+      </w:pPr>
+      <w:r>
+        <w:rPr>
+          <w:rFonts w:ascii="Consolas" w:hAnsi="Consolas"/>
+          <w:color w:val="6F5900"/>
+          <w:sz w:val="18"/>
+        </w:rPr>
+        <w:t>net-diagnostics.ts</w:t>
+      </w:r>
+      <w:r>
+        <w:t xml:space="preserve"> (</w:t>
+      </w:r>
+      <w:r>
+        <w:rPr>
+          <w:rFonts w:ascii="Consolas" w:hAnsi="Consolas"/>
+          <w:color w:val="6F5900"/>
+          <w:sz w:val="18"/>
+        </w:rPr>
+        <w:t>diagnoseHttpsEndpoint</w:t>
+      </w:r>
+      <w:r>
+        <w:t xml:space="preserve">) checks DNS then a TCP connect to </w:t>
+      </w:r>
+      <w:r>
+        <w:rPr>
+          <w:rFonts w:ascii="Consolas" w:hAnsi="Consolas"/>
+          <w:color w:val="6F5900"/>
+          <w:sz w:val="18"/>
+        </w:rPr>
+        <w:t>graph.microsoft.com:443</w:t>
+      </w:r>
+      <w:r>
+        <w:t xml:space="preserve">; </w:t>
+      </w:r>
+      <w:r>
+        <w:rPr>
+          <w:rFonts w:ascii="Consolas" w:hAnsi="Consolas"/>
+          <w:color w:val="6F5900"/>
+          <w:sz w:val="18"/>
+        </w:rPr>
+        <w:t>EmailDispatcher.diagnose()</w:t>
+      </w:r>
+      <w:r>
+        <w:t xml:space="preserve"> appends an authenticated </w:t>
+      </w:r>
+      <w:r>
+        <w:rPr>
+          <w:rFonts w:ascii="Consolas" w:hAnsi="Consolas"/>
+          <w:color w:val="6F5900"/>
+          <w:sz w:val="18"/>
+        </w:rPr>
+        <w:t>verifyConnection()</w:t>
+      </w:r>
+      <w:r>
+        <w:t xml:space="preserve"> call as a third stage, so a failure names DNS, transport or credentials rather than one opaque timeout.</w:t>
+      </w:r>
+    </w:p>
+    <w:p>
+      <w:pPr>
+        <w:pStyle w:val="Heading3"/>
+      </w:pPr>
+      <w:r>
+        <w:t>Confirming the mail path from the host</w:t>
       </w:r>
     </w:p>
     <w:p>
@@ -5656,7 +5826,7 @@
         <w:pStyle w:val="CodeBlock"/>
       </w:pPr>
       <w:r>
-        <w:t xml:space="preserve">                  ├─ resend  → HTTPS API</w:t>
+        <w:t>node server/scripts/verify-email.mjs [--send someone@company.com]</w:t>
       </w:r>
     </w:p>
     <w:p>
@@ -5664,7 +5834,7 @@
         <w:pStyle w:val="CodeBlock"/>
       </w:pPr>
       <w:r>
-        <w:t xml:space="preserve">                  ├─ graph   → Microsoft Graph over HTTPS</w:t>
+        <w:t xml:space="preserve">  1. configuration present         ← same REQUIRED keys as the boot check</w:t>
       </w:r>
     </w:p>
     <w:p>
@@ -5672,7 +5842,31 @@
         <w:pStyle w:val="CodeBlock"/>
       </w:pPr>
       <w:r>
-        <w:t xml:space="preserve">                  └─ console → log only, refused in production</w:t>
+        <w:t xml:space="preserve">  2. login.microsoftonline.com resolves</w:t>
+      </w:r>
+    </w:p>
+    <w:p>
+      <w:pPr>
+        <w:pStyle w:val="CodeBlock"/>
+      </w:pPr>
+      <w:r>
+        <w:t xml:space="preserve">  3. client-credentials token issued</w:t>
+      </w:r>
+    </w:p>
+    <w:p>
+      <w:pPr>
+        <w:pStyle w:val="CodeBlock"/>
+      </w:pPr>
+      <w:r>
+        <w:t xml:space="preserve">  4. mailbox reachable via Graph   ← proves Mail.Send consent + access policy</w:t>
+      </w:r>
+    </w:p>
+    <w:p>
+      <w:pPr>
+        <w:pStyle w:val="CodeBlock"/>
+      </w:pPr>
+      <w:r>
+        <w:t xml:space="preserve">  [5. sendMail accepted]           ← only with --send</w:t>
       </w:r>
     </w:p>
     <w:p>
@@ -5680,7 +5874,7 @@
         <w:pStyle w:val="ListBullet"/>
       </w:pPr>
       <w:r>
-        <w:t>Because the adapter is resolved per call, changing the provider in Settings takes effect immediately.</w:t>
+        <w:t>Dependency-free and untranspiled on purpose: it has to run on a box where the build is broken, which is exactly when it is needed.</w:t>
       </w:r>
     </w:p>
     <w:p>
@@ -5688,7 +5882,7 @@
         <w:pStyle w:val="ListBullet"/>
       </w:pPr>
       <w:r>
-        <w:t xml:space="preserve">SMTP transports pin to IPv4 and set connection, greeting and socket timeouts. Both were real production faults: a host without an IPv6 route produced </w:t>
+        <w:t xml:space="preserve">Reads </w:t>
       </w:r>
       <w:r>
         <w:rPr>
@@ -5696,10 +5890,21 @@
           <w:color w:val="6F5900"/>
           <w:sz w:val="18"/>
         </w:rPr>
-        <w:t>ENETUNREACH</w:t>
-      </w:r>
-      <w:r>
-        <w:t>, and an untimed socket produced a gateway timeout.</w:t>
+        <w:t>process.env</w:t>
+      </w:r>
+      <w:r>
+        <w:t xml:space="preserve"> directly, so it is run after sourcing the same env file systemd gives the service: </w:t>
+      </w:r>
+      <w:r>
+        <w:rPr>
+          <w:rFonts w:ascii="Consolas" w:hAnsi="Consolas"/>
+          <w:color w:val="6F5900"/>
+          <w:sz w:val="18"/>
+        </w:rPr>
+        <w:t>set -a; . /etc/dsr/dsr-api.env; set +a; node scripts/verify-email.mjs</w:t>
+      </w:r>
+      <w:r>
+        <w:t>.</w:t>
       </w:r>
     </w:p>
     <w:p>
@@ -5707,201 +5912,18 @@
         <w:pStyle w:val="ListBullet"/>
       </w:pPr>
       <w:r>
+        <w:t xml:space="preserve">Step 4 is the one that actually proves the Azure side is configured correctly — a valid token (step 3) only proves the app registration exists, not that </w:t>
+      </w:r>
+      <w:r>
         <w:rPr>
           <w:rFonts w:ascii="Consolas" w:hAnsi="Consolas"/>
           <w:color w:val="6F5900"/>
           <w:sz w:val="18"/>
         </w:rPr>
-        <w:t>diagnoseSmtp</w:t>
-      </w:r>
-      <w:r>
-        <w:t xml:space="preserve"> checks DNS, TCP, TLS and authentication separately and maps common errors to an operator-facing explanation.</w:t>
-      </w:r>
-    </w:p>
-    <w:p>
-      <w:pPr>
-        <w:pStyle w:val="ListBullet"/>
-      </w:pPr>
-      <w:r>
-        <w:t xml:space="preserve">This host blocks outbound 25, 465 and 587 but leaves </w:t>
-      </w:r>
-      <w:r>
-        <w:rPr>
-          <w:b/>
-        </w:rPr>
-        <w:t>2525</w:t>
-      </w:r>
-      <w:r>
-        <w:t xml:space="preserve"> open, so a relay such as SendGrid, Brevo or Mailgun works through the Custom SMTP provider on that port. Gmail publishes no alternative port, which is why Gmail must go over the API.</w:t>
-      </w:r>
-    </w:p>
-    <w:p>
-      <w:pPr>
-        <w:pStyle w:val="Heading3"/>
-      </w:pPr>
-      <w:r>
-        <w:t>Gmail authorisation</w:t>
-      </w:r>
-    </w:p>
-    <w:p>
-      <w:pPr>
-        <w:pStyle w:val="CodeBlock"/>
-      </w:pPr>
-      <w:r>
-        <w:t>admin presses Connect</w:t>
-      </w:r>
-    </w:p>
-    <w:p>
-      <w:pPr>
-        <w:pStyle w:val="CodeBlock"/>
-      </w:pPr>
-      <w:r>
-        <w:t xml:space="preserve">  ├─ POST settings/email/gmail/authorize      ← super_admin only</w:t>
-      </w:r>
-    </w:p>
-    <w:p>
-      <w:pPr>
-        <w:pStyle w:val="CodeBlock"/>
-      </w:pPr>
-      <w:r>
-        <w:t xml:space="preserve">  │     └─ GmailOauthService.begin()</w:t>
-      </w:r>
-    </w:p>
-    <w:p>
-      <w:pPr>
-        <w:pStyle w:val="CodeBlock"/>
-      </w:pPr>
-      <w:r>
-        <w:t xml:space="preserve">  │           ├─ state = 32 random bytes, held in memory with the origin</w:t>
-      </w:r>
-    </w:p>
-    <w:p>
-      <w:pPr>
-        <w:pStyle w:val="CodeBlock"/>
-      </w:pPr>
-      <w:r>
-        <w:t xml:space="preserve">  │           └─ returns accounts.google.com/o/oauth2/v2/auth?...</w:t>
-      </w:r>
-    </w:p>
-    <w:p>
-      <w:pPr>
-        <w:pStyle w:val="CodeBlock"/>
-      </w:pPr>
-      <w:r>
-        <w:t xml:space="preserve">  │                 access_type=offline  prompt=consent  scope=gmail.send</w:t>
-      </w:r>
-    </w:p>
-    <w:p>
-      <w:pPr>
-        <w:pStyle w:val="CodeBlock"/>
-      </w:pPr>
-      <w:r>
-        <w:t xml:space="preserve">  ├─ user consents on Google</w:t>
-      </w:r>
-    </w:p>
-    <w:p>
-      <w:pPr>
-        <w:pStyle w:val="CodeBlock"/>
-      </w:pPr>
-      <w:r>
-        <w:t xml:space="preserve">  └─ GET internal/admin/settings/email/gmail/callback?code&amp;state   ← unauthenticated</w:t>
-      </w:r>
-    </w:p>
-    <w:p>
-      <w:pPr>
-        <w:pStyle w:val="CodeBlock"/>
-      </w:pPr>
-      <w:r>
-        <w:t xml:space="preserve">        ├─ state looked up and consumed (single use)</w:t>
-      </w:r>
-    </w:p>
-    <w:p>
-      <w:pPr>
-        <w:pStyle w:val="CodeBlock"/>
-      </w:pPr>
-      <w:r>
-        <w:t xml:space="preserve">        ├─ code exchanged for a refresh token</w:t>
-      </w:r>
-    </w:p>
-    <w:p>
-      <w:pPr>
-        <w:pStyle w:val="CodeBlock"/>
-      </w:pPr>
-      <w:r>
-        <w:t xml:space="preserve">        ├─ GMAIL_OAUTH_REFRESH_TOKEN stored encrypted</w:t>
-      </w:r>
-    </w:p>
-    <w:p>
-      <w:pPr>
-        <w:pStyle w:val="CodeBlock"/>
-      </w:pPr>
-      <w:r>
-        <w:t xml:space="preserve">        ├─ GMAIL_AUTH=oauth2, EMAIL_PROVIDER=gmail</w:t>
-      </w:r>
-    </w:p>
-    <w:p>
-      <w:pPr>
-        <w:pStyle w:val="CodeBlock"/>
-      </w:pPr>
-      <w:r>
-        <w:t xml:space="preserve">        └─ GMAIL_USER filled from the Gmail profile API</w:t>
-      </w:r>
-    </w:p>
-    <w:p>
-      <w:pPr>
-        <w:pStyle w:val="ListBullet"/>
-      </w:pPr>
-      <w:r>
-        <w:t xml:space="preserve">The callback route cannot require a session, because Google redirects the browser to it from a different origin. </w:t>
-      </w:r>
-      <w:r>
-        <w:rPr>
-          <w:rFonts w:ascii="Consolas" w:hAnsi="Consolas"/>
-          <w:color w:val="6F5900"/>
-          <w:sz w:val="18"/>
-        </w:rPr>
-        <w:t>state</w:t>
-      </w:r>
-      <w:r>
-        <w:t xml:space="preserve"> is what ties the callback back to the administrator who started it, and it is consumed on first use.</w:t>
-      </w:r>
-    </w:p>
-    <w:p>
-      <w:pPr>
-        <w:pStyle w:val="ListBullet"/>
-      </w:pPr>
-      <w:r>
-        <w:t xml:space="preserve">The pending state lives in memory rather than in the session cookie, because that cookie is </w:t>
-      </w:r>
-      <w:r>
-        <w:rPr>
-          <w:rFonts w:ascii="Consolas" w:hAnsi="Consolas"/>
-          <w:color w:val="6F5900"/>
-          <w:sz w:val="18"/>
-        </w:rPr>
-        <w:t>SameSite=Strict</w:t>
-      </w:r>
-      <w:r>
-        <w:t xml:space="preserve"> and is therefore not sent on Google's cross-site redirect.</w:t>
-      </w:r>
-    </w:p>
-    <w:p>
-      <w:pPr>
-        <w:pStyle w:val="ListBullet"/>
-      </w:pPr>
-      <w:r>
-        <w:t xml:space="preserve">The redirect URI is derived from </w:t>
-      </w:r>
-      <w:r>
-        <w:rPr>
-          <w:rFonts w:ascii="Consolas" w:hAnsi="Consolas"/>
-          <w:color w:val="6F5900"/>
-          <w:sz w:val="18"/>
-        </w:rPr>
-        <w:t>PORTAL_INTERNAL_URL</w:t>
-      </w:r>
-      <w:r>
-        <w:t xml:space="preserve"> and shown on the Settings screen with a copy button, so it matches what is registered in Google Cloud byte for byte.</w:t>
+        <w:t>Mail.Send</w:t>
+      </w:r>
+      <w:r>
+        <w:t xml:space="preserve"> was consented or that the application access policy scopes it to the right mailbox.</w:t>
       </w:r>
     </w:p>
     <w:p>
@@ -11519,16 +11541,7 @@
         <w:t>Outbound SMTP is blocked on 25, 465 and 587</w:t>
       </w:r>
       <w:r>
-        <w:t xml:space="preserve">, so Gmail app passwords can never work here. Port </w:t>
-      </w:r>
-      <w:r>
-        <w:rPr>
-          <w:b/>
-        </w:rPr>
-        <w:t>2525</w:t>
-      </w:r>
-      <w:r>
-        <w:t xml:space="preserve"> is open, so a relay works through the Custom SMTP provider. Resend, Gmail over OAuth2 and Microsoft Graph all send over HTTPS and are unaffected.</w:t>
+        <w:t>, DigitalOcean's default anti-spam policy on new accounts. Irrelevant to this portal: Microsoft Graph, the only production email adapter, sends over HTTPS (443) and never opens an SMTP connection.</w:t>
       </w:r>
     </w:p>
     <w:p>
@@ -11550,7 +11563,7 @@
           <w:color w:val="6F5900"/>
           <w:sz w:val="18"/>
         </w:rPr>
-        <w:t>68-183-91-209.sslip.io</w:t>
+        <w:t>203-0-113-10.sslip.io</w:t>
       </w:r>
       <w:r>
         <w:t xml:space="preserve">, issued by Let's Encrypt and renewed by </w:t>
@@ -11722,7 +11735,51 @@
         <w:pStyle w:val="ListNumber"/>
       </w:pPr>
       <w:r>
-        <w:t>Add the provider option and its credential fields to the settings catalog.</w:t>
+        <w:t xml:space="preserve">Add the provider option to </w:t>
+      </w:r>
+      <w:r>
+        <w:rPr>
+          <w:rFonts w:ascii="Consolas" w:hAnsi="Consolas"/>
+          <w:color w:val="6F5900"/>
+          <w:sz w:val="18"/>
+        </w:rPr>
+        <w:t>EMAIL_PROVIDER</w:t>
+      </w:r>
+      <w:r>
+        <w:t xml:space="preserve">'s </w:t>
+      </w:r>
+      <w:r>
+        <w:rPr>
+          <w:rFonts w:ascii="Consolas" w:hAnsi="Consolas"/>
+          <w:color w:val="6F5900"/>
+          <w:sz w:val="18"/>
+        </w:rPr>
+        <w:t>options</w:t>
+      </w:r>
+      <w:r>
+        <w:t xml:space="preserve"> and its credential fields to the settings catalog, marked </w:t>
+      </w:r>
+      <w:r>
+        <w:rPr>
+          <w:rFonts w:ascii="Consolas" w:hAnsi="Consolas"/>
+          <w:color w:val="6F5900"/>
+          <w:sz w:val="18"/>
+        </w:rPr>
+        <w:t>envOnly: true</w:t>
+      </w:r>
+      <w:r>
+        <w:t xml:space="preserve"> if the value should live in </w:t>
+      </w:r>
+      <w:r>
+        <w:rPr>
+          <w:rFonts w:ascii="Consolas" w:hAnsi="Consolas"/>
+          <w:color w:val="6F5900"/>
+          <w:sz w:val="18"/>
+        </w:rPr>
+        <w:t>/etc/dsr/dsr-api.env</w:t>
+      </w:r>
+      <w:r>
+        <w:t xml:space="preserve"> rather than be database-writable.</w:t>
       </w:r>
     </w:p>
     <w:p>
@@ -11730,7 +11787,7 @@
         <w:pStyle w:val="ListNumber"/>
       </w:pPr>
       <w:r>
-        <w:t xml:space="preserve">If it speaks SMTP, reuse </w:t>
+        <w:t xml:space="preserve">If it speaks HTTPS, reuse </w:t>
       </w:r>
       <w:r>
         <w:rPr>
@@ -11738,10 +11795,21 @@
           <w:color w:val="6F5900"/>
           <w:sz w:val="18"/>
         </w:rPr>
-        <w:t>createSmtpTransport</w:t>
-      </w:r>
-      <w:r>
-        <w:t xml:space="preserve"> so it inherits the IPv4 pinning and timeouts.</w:t>
+        <w:t>diagnoseHttpsEndpoint</w:t>
+      </w:r>
+      <w:r>
+        <w:t xml:space="preserve"> from </w:t>
+      </w:r>
+      <w:r>
+        <w:rPr>
+          <w:rFonts w:ascii="Consolas" w:hAnsi="Consolas"/>
+          <w:color w:val="6F5900"/>
+          <w:sz w:val="18"/>
+        </w:rPr>
+        <w:t>net-diagnostics.ts</w:t>
+      </w:r>
+      <w:r>
+        <w:t xml:space="preserve"> so it inherits the staged DNS/TCP diagnostic.</w:t>
       </w:r>
     </w:p>
     <w:p>

</xml_diff>

<commit_message>
Point the email env-file references at /opt/dsr/server/.env
The spec invented /etc/dsr/dsr-api.env; the actual deployment writes and
loads /opt/dsr/server/.env (deploy.sh, dsr-api.service, backup.sh). Replace
the imagined path everywhere it leaked into code, tests, docs and the
design spec, and correct the spec's imagined 0640/root:dsr to the real
chmod 600/dsr:dsr.

Co-Authored-By: Claude Opus 5 (1M context) <noreply@anthropic.com>
Claude-Session: https://claude.ai/code/session_01NtXEr3cBGDqXwFLmPnFVye
</commit_message>
<xml_diff>
--- a/docs/DSR Portal - Developer Handbook.docx
+++ b/docs/DSR Portal - Developer Handbook.docx
@@ -5665,7 +5665,7 @@
           <w:color w:val="6F5900"/>
           <w:sz w:val="18"/>
         </w:rPr>
-        <w:t>/etc/dsr/dsr-api.env</w:t>
+        <w:t>/opt/dsr/server/.env</w:t>
       </w:r>
       <w:r>
         <w:t xml:space="preserve">, and </w:t>
@@ -5901,10 +5901,43 @@
           <w:color w:val="6F5900"/>
           <w:sz w:val="18"/>
         </w:rPr>
-        <w:t>set -a; . /etc/dsr/dsr-api.env; set +a; node scripts/verify-email.mjs</w:t>
-      </w:r>
-      <w:r>
-        <w:t>.</w:t>
+        <w:t>set -a; . /opt/dsr/server/.env; set +a; node scripts/verify-email.mjs</w:t>
+      </w:r>
+      <w:r>
+        <w:t xml:space="preserve">. That file is </w:t>
+      </w:r>
+      <w:r>
+        <w:rPr>
+          <w:rFonts w:ascii="Consolas" w:hAnsi="Consolas"/>
+          <w:color w:val="6F5900"/>
+          <w:sz w:val="18"/>
+        </w:rPr>
+        <w:t>chmod 600</w:t>
+      </w:r>
+      <w:r>
+        <w:t xml:space="preserve">, owned by </w:t>
+      </w:r>
+      <w:r>
+        <w:rPr>
+          <w:rFonts w:ascii="Consolas" w:hAnsi="Consolas"/>
+          <w:color w:val="6F5900"/>
+          <w:sz w:val="18"/>
+        </w:rPr>
+        <w:t>dsr</w:t>
+      </w:r>
+      <w:r>
+        <w:t xml:space="preserve">, so this needs </w:t>
+      </w:r>
+      <w:r>
+        <w:rPr>
+          <w:rFonts w:ascii="Consolas" w:hAnsi="Consolas"/>
+          <w:color w:val="6F5900"/>
+          <w:sz w:val="18"/>
+        </w:rPr>
+        <w:t>sudo -u dsr</w:t>
+      </w:r>
+      <w:r>
+        <w:t xml:space="preserve"> or root, not an unprivileged shell.</w:t>
       </w:r>
     </w:p>
     <w:p>
@@ -11776,7 +11809,7 @@
           <w:color w:val="6F5900"/>
           <w:sz w:val="18"/>
         </w:rPr>
-        <w:t>/etc/dsr/dsr-api.env</w:t>
+        <w:t>/opt/dsr/server/.env</w:t>
       </w:r>
       <w:r>
         <w:t xml:space="preserve"> rather than be database-writable.</w:t>

</xml_diff>

<commit_message>
Update the handbook and spec for the strategy split that already shipped
The Developer Handbook's server/src/auth table still described auth.service.ts
as doing password verification directly and did not list password.strategy.ts
or break-glass.ts. Update the auth.service.ts entry and add rows for both new
files, then regenerate the shipped .docx.

Also fix the one sentence in the SSO seams design spec that describes the
implemented ordering backwards: it said login() applies the break-glass rule
before calling the strategy, which is policy-before-authentication — the exact
oracle the design exists to prevent. The code has always authenticated first;
only the prose was wrong. State the real order and why it matters, so the
reasoning carries forward into the SSO sub-project rather than just the
sequence.

Co-Authored-By: Claude Opus 5 (1M context) <noreply@anthropic.com>
Claude-Session: https://claude.ai/code/session_01NtXEr3cBGDqXwFLmPnFVye
</commit_message>
<xml_diff>
--- a/docs/DSR Portal - Developer Handbook.docx
+++ b/docs/DSR Portal - Developer Handbook.docx
@@ -658,7 +658,7 @@
         <w:rPr>
           <w:b w:val="0"/>
         </w:rPr>
-        <w:t>172 first-party source files, 25,896 lines, excluding lock files, migration snapshots and vendored assets.</w:t>
+        <w:t>204 first-party source files, 32,837 lines, excluding lock files, migration snapshots and vendored assets.</w:t>
       </w:r>
     </w:p>
     <w:p>
@@ -1352,7 +1352,7 @@
                 <w:color w:val="6F5900"/>
                 <w:sz w:val="18"/>
               </w:rPr>
-              <w:t>auth.service.ts</w:t>
+              <w:t>password.strategy.ts</w:t>
             </w:r>
           </w:p>
         </w:tc>
@@ -1365,12 +1365,6 @@
               <w:rPr>
                 <w:sz w:val="18"/>
               </w:rPr>
-            </w:r>
-            <w:r>
-              <w:rPr>
-                <w:sz w:val="18"/>
-              </w:rPr>
-              <w:t xml:space="preserve">Password verification with argon2id, session creation, idle and absolute expiry, and </w:t>
             </w:r>
             <w:r>
               <w:rPr>
@@ -1378,13 +1372,13 @@
                 <w:color w:val="6F5900"/>
                 <w:sz w:val="18"/>
               </w:rPr>
-              <w:t>zoneContextFor</w:t>
-            </w:r>
-            <w:r>
-              <w:rPr>
-                <w:sz w:val="18"/>
-              </w:rPr>
-              <w:t xml:space="preserve"> which maps a user to their RLS context.</w:t>
+              <w:t>PasswordStrategy.authenticate</w:t>
+            </w:r>
+            <w:r>
+              <w:rPr>
+                <w:sz w:val="18"/>
+              </w:rPr>
+              <w:t>: the only code that knows a password exists. Verifies the argon2id hash against a dummy hash for unknown users, so lookup and mismatch take the same time.</w:t>
             </w:r>
           </w:p>
         </w:tc>
@@ -1406,7 +1400,7 @@
                 <w:color w:val="6F5900"/>
                 <w:sz w:val="18"/>
               </w:rPr>
-              <w:t>auth.guard.ts</w:t>
+              <w:t>auth.service.ts</w:t>
             </w:r>
           </w:p>
         </w:tc>
@@ -1426,13 +1420,13 @@
                 <w:color w:val="6F5900"/>
                 <w:sz w:val="18"/>
               </w:rPr>
-              <w:t>AuthGuard</w:t>
-            </w:r>
-            <w:r>
-              <w:rPr>
-                <w:sz w:val="18"/>
-              </w:rPr>
-              <w:t xml:space="preserve"> resolves the session cookie and attaches </w:t>
+              <w:t>startSession</w:t>
+            </w:r>
+            <w:r>
+              <w:rPr>
+                <w:sz w:val="18"/>
+              </w:rPr>
+              <w:t xml:space="preserve">: provider-agnostic session creation, the active-account check, idle and absolute expiry, </w:t>
             </w:r>
             <w:r>
               <w:rPr>
@@ -1440,13 +1434,13 @@
                 <w:color w:val="6F5900"/>
                 <w:sz w:val="18"/>
               </w:rPr>
-              <w:t>req.user</w:t>
-            </w:r>
-            <w:r>
-              <w:rPr>
-                <w:sz w:val="18"/>
-              </w:rPr>
-              <w:t xml:space="preserve"> and </w:t>
+              <w:t>zoneContextFor</w:t>
+            </w:r>
+            <w:r>
+              <w:rPr>
+                <w:sz w:val="18"/>
+              </w:rPr>
+              <w:t xml:space="preserve"> which maps a user to their RLS context, and </w:t>
             </w:r>
             <w:r>
               <w:rPr>
@@ -1454,13 +1448,27 @@
                 <w:color w:val="6F5900"/>
                 <w:sz w:val="18"/>
               </w:rPr>
-              <w:t>req.zoneCtx</w:t>
-            </w:r>
-            <w:r>
-              <w:rPr>
-                <w:sz w:val="18"/>
-              </w:rPr>
-              <w:t xml:space="preserve">. </w:t>
+              <w:t>login</w:t>
+            </w:r>
+            <w:r>
+              <w:rPr>
+                <w:sz w:val="18"/>
+              </w:rPr>
+              <w:t>, which calls the password strategy then applies the break-glass policy.</w:t>
+            </w:r>
+          </w:p>
+        </w:tc>
+      </w:tr>
+      <w:tr>
+        <w:tc>
+          <w:tcPr>
+            <w:tcW w:type="dxa" w:w="2448"/>
+          </w:tcPr>
+          <w:p>
+            <w:r>
+              <w:rPr>
+                <w:sz w:val="18"/>
+              </w:rPr>
             </w:r>
             <w:r>
               <w:rPr>
@@ -1468,13 +1476,61 @@
                 <w:color w:val="6F5900"/>
                 <w:sz w:val="18"/>
               </w:rPr>
-              <w:t>satisfies()</w:t>
-            </w:r>
-            <w:r>
-              <w:rPr>
-                <w:sz w:val="18"/>
-              </w:rPr>
-              <w:t xml:space="preserve"> implements the role ladder.</w:t>
+              <w:t>break-glass.ts</w:t>
+            </w:r>
+          </w:p>
+        </w:tc>
+        <w:tc>
+          <w:tcPr>
+            <w:tcW w:type="dxa" w:w="6768"/>
+          </w:tcPr>
+          <w:p>
+            <w:r>
+              <w:rPr>
+                <w:sz w:val="18"/>
+              </w:rPr>
+            </w:r>
+            <w:r>
+              <w:rPr>
+                <w:rFonts w:ascii="Consolas" w:hAnsi="Consolas"/>
+                <w:color w:val="6F5900"/>
+                <w:sz w:val="18"/>
+              </w:rPr>
+              <w:t>canUsePassword</w:t>
+            </w:r>
+            <w:r>
+              <w:rPr>
+                <w:sz w:val="18"/>
+              </w:rPr>
+              <w:t xml:space="preserve">: who may still sign in with a password once </w:t>
+            </w:r>
+            <w:r>
+              <w:rPr>
+                <w:rFonts w:ascii="Consolas" w:hAnsi="Consolas"/>
+                <w:color w:val="6F5900"/>
+                <w:sz w:val="18"/>
+              </w:rPr>
+              <w:t>SSO_ENABLED</w:t>
+            </w:r>
+            <w:r>
+              <w:rPr>
+                <w:sz w:val="18"/>
+              </w:rPr>
+              <w:t xml:space="preserve"> is true, and </w:t>
+            </w:r>
+            <w:r>
+              <w:rPr>
+                <w:rFonts w:ascii="Consolas" w:hAnsi="Consolas"/>
+                <w:color w:val="6F5900"/>
+                <w:sz w:val="18"/>
+              </w:rPr>
+              <w:t>PasswordDisabledException</w:t>
+            </w:r>
+            <w:r>
+              <w:rPr>
+                <w:sz w:val="18"/>
+              </w:rPr>
+              <w:t>, the refusal it raises.</w:t>
             </w:r>
           </w:p>
         </w:tc>
@@ -1496,7 +1552,7 @@
                 <w:color w:val="6F5900"/>
                 <w:sz w:val="18"/>
               </w:rPr>
-              <w:t>auth.controller.ts</w:t>
+              <w:t>auth.guard.ts</w:t>
             </w:r>
           </w:p>
         </w:tc>
@@ -1509,12 +1565,6 @@
               <w:rPr>
                 <w:sz w:val="18"/>
               </w:rPr>
-            </w:r>
-            <w:r>
-              <w:rPr>
-                <w:sz w:val="18"/>
-              </w:rPr>
-              <w:t xml:space="preserve">Sign in, sign out, and </w:t>
             </w:r>
             <w:r>
               <w:rPr>
@@ -1522,13 +1572,13 @@
                 <w:color w:val="6F5900"/>
                 <w:sz w:val="18"/>
               </w:rPr>
-              <w:t>me</w:t>
-            </w:r>
-            <w:r>
-              <w:rPr>
-                <w:sz w:val="18"/>
-              </w:rPr>
-              <w:t xml:space="preserve">. Also owns </w:t>
+              <w:t>AuthGuard</w:t>
+            </w:r>
+            <w:r>
+              <w:rPr>
+                <w:sz w:val="18"/>
+              </w:rPr>
+              <w:t xml:space="preserve"> resolves the session cookie, attaches </w:t>
             </w:r>
             <w:r>
               <w:rPr>
@@ -1536,13 +1586,55 @@
                 <w:color w:val="6F5900"/>
                 <w:sz w:val="18"/>
               </w:rPr>
-              <w:t>cookieSecure()</w:t>
-            </w:r>
-            <w:r>
-              <w:rPr>
-                <w:sz w:val="18"/>
-              </w:rPr>
-              <w:t>, which decides whether session cookies carry the Secure flag.</w:t>
+              <w:t>req.user</w:t>
+            </w:r>
+            <w:r>
+              <w:rPr>
+                <w:sz w:val="18"/>
+              </w:rPr>
+              <w:t xml:space="preserve"> and </w:t>
+            </w:r>
+            <w:r>
+              <w:rPr>
+                <w:rFonts w:ascii="Consolas" w:hAnsi="Consolas"/>
+                <w:color w:val="6F5900"/>
+                <w:sz w:val="18"/>
+              </w:rPr>
+              <w:t>req.zoneCtx</w:t>
+            </w:r>
+            <w:r>
+              <w:rPr>
+                <w:sz w:val="18"/>
+              </w:rPr>
+              <w:t xml:space="preserve">, and checks the handler's </w:t>
+            </w:r>
+            <w:r>
+              <w:rPr>
+                <w:rFonts w:ascii="Consolas" w:hAnsi="Consolas"/>
+                <w:color w:val="6F5900"/>
+                <w:sz w:val="18"/>
+              </w:rPr>
+              <w:t>@Requires(...)</w:t>
+            </w:r>
+            <w:r>
+              <w:rPr>
+                <w:sz w:val="18"/>
+              </w:rPr>
+              <w:t xml:space="preserve"> permission with </w:t>
+            </w:r>
+            <w:r>
+              <w:rPr>
+                <w:rFonts w:ascii="Consolas" w:hAnsi="Consolas"/>
+                <w:color w:val="6F5900"/>
+                <w:sz w:val="18"/>
+              </w:rPr>
+              <w:t>hasPermission()</w:t>
+            </w:r>
+            <w:r>
+              <w:rPr>
+                <w:sz w:val="18"/>
+              </w:rPr>
+              <w:t>.</w:t>
             </w:r>
           </w:p>
         </w:tc>
@@ -1564,7 +1656,7 @@
                 <w:color w:val="6F5900"/>
                 <w:sz w:val="18"/>
               </w:rPr>
-              <w:t>auth.guard.spec.ts</w:t>
+              <w:t>permissions.ts</w:t>
             </w:r>
           </w:p>
         </w:tc>
@@ -1582,7 +1674,205 @@
               <w:rPr>
                 <w:sz w:val="18"/>
               </w:rPr>
-              <w:t>Unit tests for the role ladder, including the auditor exclusion.</w:t>
+              <w:t xml:space="preserve">The permission table: the seven named permissions and the set each role holds. Also </w:t>
+            </w:r>
+            <w:r>
+              <w:rPr>
+                <w:rFonts w:ascii="Consolas" w:hAnsi="Consolas"/>
+                <w:color w:val="6F5900"/>
+                <w:sz w:val="18"/>
+              </w:rPr>
+              <w:t>ZONE_WIDE_ROLES</w:t>
+            </w:r>
+            <w:r>
+              <w:rPr>
+                <w:sz w:val="18"/>
+              </w:rPr>
+              <w:t>, the roles whose session sees every zone.</w:t>
+            </w:r>
+          </w:p>
+        </w:tc>
+      </w:tr>
+      <w:tr>
+        <w:tc>
+          <w:tcPr>
+            <w:tcW w:type="dxa" w:w="2448"/>
+          </w:tcPr>
+          <w:p>
+            <w:r>
+              <w:rPr>
+                <w:sz w:val="18"/>
+              </w:rPr>
+            </w:r>
+            <w:r>
+              <w:rPr>
+                <w:rFonts w:ascii="Consolas" w:hAnsi="Consolas"/>
+                <w:color w:val="6F5900"/>
+                <w:sz w:val="18"/>
+              </w:rPr>
+              <w:t>admin-policy.ts</w:t>
+            </w:r>
+          </w:p>
+        </w:tc>
+        <w:tc>
+          <w:tcPr>
+            <w:tcW w:type="dxa" w:w="6768"/>
+          </w:tcPr>
+          <w:p>
+            <w:r>
+              <w:rPr>
+                <w:sz w:val="18"/>
+              </w:rPr>
+            </w:r>
+            <w:r>
+              <w:rPr>
+                <w:rFonts w:ascii="Consolas" w:hAnsi="Consolas"/>
+                <w:color w:val="6F5900"/>
+                <w:sz w:val="18"/>
+              </w:rPr>
+              <w:t>canAssignRole</w:t>
+            </w:r>
+            <w:r>
+              <w:rPr>
+                <w:sz w:val="18"/>
+              </w:rPr>
+              <w:t>: who may produce a user with a given role in a given zone. Both the create and the update path call it.</w:t>
+            </w:r>
+          </w:p>
+        </w:tc>
+      </w:tr>
+      <w:tr>
+        <w:tc>
+          <w:tcPr>
+            <w:tcW w:type="dxa" w:w="2448"/>
+          </w:tcPr>
+          <w:p>
+            <w:r>
+              <w:rPr>
+                <w:sz w:val="18"/>
+              </w:rPr>
+            </w:r>
+            <w:r>
+              <w:rPr>
+                <w:rFonts w:ascii="Consolas" w:hAnsi="Consolas"/>
+                <w:color w:val="6F5900"/>
+                <w:sz w:val="18"/>
+              </w:rPr>
+              <w:t>auth.controller.ts</w:t>
+            </w:r>
+          </w:p>
+        </w:tc>
+        <w:tc>
+          <w:tcPr>
+            <w:tcW w:type="dxa" w:w="6768"/>
+          </w:tcPr>
+          <w:p>
+            <w:r>
+              <w:rPr>
+                <w:sz w:val="18"/>
+              </w:rPr>
+            </w:r>
+            <w:r>
+              <w:rPr>
+                <w:sz w:val="18"/>
+              </w:rPr>
+              <w:t xml:space="preserve">Sign in, sign out, and </w:t>
+            </w:r>
+            <w:r>
+              <w:rPr>
+                <w:rFonts w:ascii="Consolas" w:hAnsi="Consolas"/>
+                <w:color w:val="6F5900"/>
+                <w:sz w:val="18"/>
+              </w:rPr>
+              <w:t>me</w:t>
+            </w:r>
+            <w:r>
+              <w:rPr>
+                <w:sz w:val="18"/>
+              </w:rPr>
+              <w:t xml:space="preserve">. Also owns </w:t>
+            </w:r>
+            <w:r>
+              <w:rPr>
+                <w:rFonts w:ascii="Consolas" w:hAnsi="Consolas"/>
+                <w:color w:val="6F5900"/>
+                <w:sz w:val="18"/>
+              </w:rPr>
+              <w:t>cookieSecure()</w:t>
+            </w:r>
+            <w:r>
+              <w:rPr>
+                <w:sz w:val="18"/>
+              </w:rPr>
+              <w:t>, which decides whether session cookies carry the Secure flag.</w:t>
+            </w:r>
+          </w:p>
+        </w:tc>
+      </w:tr>
+      <w:tr>
+        <w:tc>
+          <w:tcPr>
+            <w:tcW w:type="dxa" w:w="2448"/>
+          </w:tcPr>
+          <w:p>
+            <w:r>
+              <w:rPr>
+                <w:sz w:val="18"/>
+              </w:rPr>
+            </w:r>
+            <w:r>
+              <w:rPr>
+                <w:rFonts w:ascii="Consolas" w:hAnsi="Consolas"/>
+                <w:color w:val="6F5900"/>
+                <w:sz w:val="18"/>
+              </w:rPr>
+              <w:t>permissions.spec.ts</w:t>
+            </w:r>
+            <w:r>
+              <w:rPr>
+                <w:sz w:val="18"/>
+              </w:rPr>
+              <w:t xml:space="preserve">, </w:t>
+            </w:r>
+            <w:r>
+              <w:rPr>
+                <w:rFonts w:ascii="Consolas" w:hAnsi="Consolas"/>
+                <w:color w:val="6F5900"/>
+                <w:sz w:val="18"/>
+              </w:rPr>
+              <w:t>admin-policy.spec.ts</w:t>
+            </w:r>
+            <w:r>
+              <w:rPr>
+                <w:sz w:val="18"/>
+              </w:rPr>
+              <w:t xml:space="preserve">, </w:t>
+            </w:r>
+            <w:r>
+              <w:rPr>
+                <w:rFonts w:ascii="Consolas" w:hAnsi="Consolas"/>
+                <w:color w:val="6F5900"/>
+                <w:sz w:val="18"/>
+              </w:rPr>
+              <w:t>break-glass.spec.ts</w:t>
+            </w:r>
+          </w:p>
+        </w:tc>
+        <w:tc>
+          <w:tcPr>
+            <w:tcW w:type="dxa" w:w="6768"/>
+          </w:tcPr>
+          <w:p>
+            <w:r>
+              <w:rPr>
+                <w:sz w:val="18"/>
+              </w:rPr>
+            </w:r>
+            <w:r>
+              <w:rPr>
+                <w:sz w:val="18"/>
+              </w:rPr>
+              <w:t>Unit tests for the permission table, role assignment (including the auditor's read-only lane), and the break-glass policy across role × SSO state.</w:t>
             </w:r>
           </w:p>
         </w:tc>
@@ -2814,7 +3104,7 @@
               <w:rPr>
                 <w:sz w:val="18"/>
               </w:rPr>
-              <w:t xml:space="preserve"> flag locks the six email keys to the environment.</w:t>
+              <w:t xml:space="preserve"> flag locks the five email keys to the environment.</w:t>
             </w:r>
           </w:p>
         </w:tc>
@@ -5508,7 +5798,7 @@
         <w:pStyle w:val="CodeBlock"/>
       </w:pPr>
       <w:r>
-        <w:t xml:space="preserve">             ├─ satisfies(role, @Roles)      ← the ladder, auditor excluded</w:t>
+        <w:t xml:space="preserve">             ├─ hasPermission(role, @Requires)  ← the permission table</w:t>
       </w:r>
     </w:p>
     <w:p>
@@ -5532,7 +5822,7 @@
         <w:rPr>
           <w:b w:val="0"/>
         </w:rPr>
-        <w:t>The ladder is `zone_agent &lt; zone_manager &lt; admin &lt; super_admin`. `auditor` sits outside it: it never inherits write access, and a route open to auditors does not become open to every ladder role. That subtlety is unit-tested in `auth.guard.spec.ts`.</w:t>
+        <w:t>There is no ladder. `ROLE_PERMISSIONS` in `permissions.ts` grants each of the five roles an explicit list drawn from seven permissions, and `@Requires('team.manage')` on a handler asks for exactly one of them. Nothing is inherited by rank, which is what keeps `auditor` read-only without a carve-out: it holds `audit.read` and nothing else. The table is unit-tested in `permissions.spec.ts`, and who may create whom in `admin-policy.spec.ts`. `0013_role-matrix.sql` enforces the same matrix in Postgres, so an application bug cannot write past it.</w:t>
       </w:r>
     </w:p>
     <w:p>
@@ -5610,17 +5900,6 @@
           <w:color w:val="6F5900"/>
           <w:sz w:val="18"/>
         </w:rPr>
-        <w:t>EMAIL_FROM_NAME</w:t>
-      </w:r>
-      <w:r>
-        <w:t xml:space="preserve">, </w:t>
-      </w:r>
-      <w:r>
-        <w:rPr>
-          <w:rFonts w:ascii="Consolas" w:hAnsi="Consolas"/>
-          <w:color w:val="6F5900"/>
-          <w:sz w:val="18"/>
-        </w:rPr>
         <w:t>PRIVACY_MAILBOX</w:t>
       </w:r>
       <w:r>
@@ -5690,7 +5969,7 @@
         <w:t>400</w:t>
       </w:r>
       <w:r>
-        <w:t xml:space="preserve"> for any of the six.</w:t>
+        <w:t xml:space="preserve"> for any of the five. There is no sender-name key: the display name on outgoing mail comes from the shared mailbox's properties in Exchange, and no adapter reads one.</w:t>
       </w:r>
     </w:p>
     <w:p>
@@ -5739,7 +6018,7 @@
         <w:t>app.listen()</w:t>
       </w:r>
       <w:r>
-        <w:t xml:space="preserve">. When </w:t>
+        <w:t xml:space="preserve">. </w:t>
       </w:r>
       <w:r>
         <w:rPr>
@@ -5747,10 +6026,76 @@
           <w:color w:val="6F5900"/>
           <w:sz w:val="18"/>
         </w:rPr>
-        <w:t>EMAIL_PROVIDER=graph</w:t>
-      </w:r>
-      <w:r>
-        <w:t>, all four required keys must be non-empty or the process exits non-zero, naming every missing key and the env file path in the log.</w:t>
+        <w:t>EMAIL_PROVIDER</w:t>
+      </w:r>
+      <w:r>
+        <w:t xml:space="preserve"> must be exactly </w:t>
+      </w:r>
+      <w:r>
+        <w:rPr>
+          <w:rFonts w:ascii="Consolas" w:hAnsi="Consolas"/>
+          <w:color w:val="6F5900"/>
+          <w:sz w:val="18"/>
+        </w:rPr>
+        <w:t>graph</w:t>
+      </w:r>
+      <w:r>
+        <w:t xml:space="preserve"> or </w:t>
+      </w:r>
+      <w:r>
+        <w:rPr>
+          <w:rFonts w:ascii="Consolas" w:hAnsi="Consolas"/>
+          <w:color w:val="6F5900"/>
+          <w:sz w:val="18"/>
+        </w:rPr>
+        <w:t>console</w:t>
+      </w:r>
+      <w:r>
+        <w:t xml:space="preserve"> — </w:t>
+      </w:r>
+      <w:r>
+        <w:rPr>
+          <w:rFonts w:ascii="Consolas" w:hAnsi="Consolas"/>
+          <w:color w:val="6F5900"/>
+          <w:sz w:val="18"/>
+        </w:rPr>
+        <w:t>Graph</w:t>
+      </w:r>
+      <w:r>
+        <w:t xml:space="preserve">, </w:t>
+      </w:r>
+      <w:r>
+        <w:rPr>
+          <w:rFonts w:ascii="Consolas" w:hAnsi="Consolas"/>
+          <w:color w:val="6F5900"/>
+          <w:sz w:val="18"/>
+        </w:rPr>
+        <w:t xml:space="preserve">graph </w:t>
+      </w:r>
+      <w:r>
+        <w:t xml:space="preserve"> and a leftover </w:t>
+      </w:r>
+      <w:r>
+        <w:rPr>
+          <w:rFonts w:ascii="Consolas" w:hAnsi="Consolas"/>
+          <w:color w:val="6F5900"/>
+          <w:sz w:val="18"/>
+        </w:rPr>
+        <w:t>smtp</w:t>
+      </w:r>
+      <w:r>
+        <w:t xml:space="preserve"> are rejected by name, rather than passing a check that requires nothing of them and then throwing on the first send. When it is </w:t>
+      </w:r>
+      <w:r>
+        <w:rPr>
+          <w:rFonts w:ascii="Consolas" w:hAnsi="Consolas"/>
+          <w:color w:val="6F5900"/>
+          <w:sz w:val="18"/>
+        </w:rPr>
+        <w:t>graph</w:t>
+      </w:r>
+      <w:r>
+        <w:t>, all four required keys must be non-empty. Either failure exits non-zero, naming the offending value or every missing key, and the env file path.</w:t>
       </w:r>
     </w:p>
     <w:p>
@@ -6233,7 +6578,7 @@
         <w:rPr>
           <w:b w:val="0"/>
         </w:rPr>
-        <w:t>65 endpoints. Everything under `/public/` is unauthenticated by design; everything under `/internal/` requires a session cookie and, where shown, a role.</w:t>
+        <w:t>62 endpoints. Everything under `/public/` is unauthenticated by design; everything under `/internal/` requires a session cookie and, where shown, a role.</w:t>
       </w:r>
     </w:p>
     <w:p>
@@ -6771,7 +7116,7 @@
                 <w:b/>
                 <w:sz w:val="18"/>
               </w:rPr>
-              <w:t>Roles</w:t>
+              <w:t>Requires</w:t>
             </w:r>
           </w:p>
         </w:tc>
@@ -6829,7 +7174,7 @@
               <w:rPr>
                 <w:sz w:val="18"/>
               </w:rPr>
-              <w:t>admin, zone_manager</w:t>
+              <w:t>team.manage</w:t>
             </w:r>
           </w:p>
         </w:tc>
@@ -6887,7 +7232,7 @@
               <w:rPr>
                 <w:sz w:val="18"/>
               </w:rPr>
-              <w:t>admin, zone_manager</w:t>
+              <w:t>team.manage</w:t>
             </w:r>
           </w:p>
         </w:tc>
@@ -6945,7 +7290,7 @@
               <w:rPr>
                 <w:sz w:val="18"/>
               </w:rPr>
-              <w:t>admin, zone_manager</w:t>
+              <w:t>team.manage</w:t>
             </w:r>
           </w:p>
         </w:tc>
@@ -7003,7 +7348,7 @@
               <w:rPr>
                 <w:sz w:val="18"/>
               </w:rPr>
-              <w:t>admin, zone_manager</w:t>
+              <w:t>team.manage</w:t>
             </w:r>
           </w:p>
         </w:tc>
@@ -7061,7 +7406,7 @@
               <w:rPr>
                 <w:sz w:val="18"/>
               </w:rPr>
-              <w:t>super_admin</w:t>
+              <w:t>instance.administer</w:t>
             </w:r>
           </w:p>
         </w:tc>
@@ -7119,7 +7464,7 @@
               <w:rPr>
                 <w:sz w:val="18"/>
               </w:rPr>
-              <w:t>admin, zone_manager</w:t>
+              <w:t>team.manage</w:t>
             </w:r>
           </w:p>
         </w:tc>
@@ -7177,7 +7522,7 @@
               <w:rPr>
                 <w:sz w:val="18"/>
               </w:rPr>
-              <w:t>admin, zone_manager</w:t>
+              <w:t>team.manage</w:t>
             </w:r>
           </w:p>
         </w:tc>
@@ -7235,7 +7580,7 @@
               <w:rPr>
                 <w:sz w:val="18"/>
               </w:rPr>
-              <w:t>admin, auditor</w:t>
+              <w:t>audit.read</w:t>
             </w:r>
           </w:p>
         </w:tc>
@@ -7293,7 +7638,7 @@
               <w:rPr>
                 <w:sz w:val="18"/>
               </w:rPr>
-              <w:t>admin, auditor</w:t>
+              <w:t>audit.read</w:t>
             </w:r>
           </w:p>
         </w:tc>
@@ -7699,7 +8044,7 @@
               <w:rPr>
                 <w:sz w:val="18"/>
               </w:rPr>
-              <w:t>admin, zone_manager, approver</w:t>
+              <w:t>cases.work</w:t>
             </w:r>
           </w:p>
         </w:tc>
@@ -7757,7 +8102,7 @@
               <w:rPr>
                 <w:sz w:val="18"/>
               </w:rPr>
-              <w:t>admin, zone_manager, approver</w:t>
+              <w:t>cases.work</w:t>
             </w:r>
           </w:p>
         </w:tc>
@@ -7815,7 +8160,7 @@
               <w:rPr>
                 <w:sz w:val="18"/>
               </w:rPr>
-              <w:t>admin, zone_manager, approver</w:t>
+              <w:t>cases.work</w:t>
             </w:r>
           </w:p>
         </w:tc>
@@ -7873,7 +8218,7 @@
               <w:rPr>
                 <w:sz w:val="18"/>
               </w:rPr>
-              <w:t>admin, zone_manager, approver</w:t>
+              <w:t>cases.work</w:t>
             </w:r>
           </w:p>
         </w:tc>
@@ -7931,7 +8276,7 @@
               <w:rPr>
                 <w:sz w:val="18"/>
               </w:rPr>
-              <w:t>admin, zone_manager, approver</w:t>
+              <w:t>cases.work</w:t>
             </w:r>
           </w:p>
         </w:tc>
@@ -7989,7 +8334,7 @@
               <w:rPr>
                 <w:sz w:val="18"/>
               </w:rPr>
-              <w:t>admin, zone_manager, approver</w:t>
+              <w:t>cases.work</w:t>
             </w:r>
           </w:p>
         </w:tc>
@@ -8047,7 +8392,7 @@
               <w:rPr>
                 <w:sz w:val="18"/>
               </w:rPr>
-              <w:t>admin</w:t>
+              <w:t>system.operate</w:t>
             </w:r>
           </w:p>
         </w:tc>
@@ -8163,7 +8508,7 @@
               <w:rPr>
                 <w:sz w:val="18"/>
               </w:rPr>
-              <w:t>admin, zone_manager</w:t>
+              <w:t>config.manage</w:t>
             </w:r>
           </w:p>
         </w:tc>
@@ -8221,7 +8566,7 @@
               <w:rPr>
                 <w:sz w:val="18"/>
               </w:rPr>
-              <w:t>admin, zone_manager, approver</w:t>
+              <w:t>cases.work</w:t>
             </w:r>
           </w:p>
         </w:tc>
@@ -8279,7 +8624,7 @@
               <w:rPr>
                 <w:sz w:val="18"/>
               </w:rPr>
-              <w:t>admin, zone_manager, approver</w:t>
+              <w:t>cases.work</w:t>
             </w:r>
           </w:p>
         </w:tc>
@@ -8337,7 +8682,7 @@
               <w:rPr>
                 <w:sz w:val="18"/>
               </w:rPr>
-              <w:t>admin, zone_manager, approver</w:t>
+              <w:t>cases.work</w:t>
             </w:r>
           </w:p>
         </w:tc>
@@ -8685,7 +9030,7 @@
               <w:rPr>
                 <w:sz w:val="18"/>
               </w:rPr>
-              <w:t>admin, zone_manager</w:t>
+              <w:t>reports.run</w:t>
             </w:r>
           </w:p>
         </w:tc>
@@ -8743,7 +9088,7 @@
               <w:rPr>
                 <w:sz w:val="18"/>
               </w:rPr>
-              <w:t>admin, zone_manager</w:t>
+              <w:t>reports.run</w:t>
             </w:r>
           </w:p>
         </w:tc>
@@ -8801,7 +9146,7 @@
               <w:rPr>
                 <w:sz w:val="18"/>
               </w:rPr>
-              <w:t>admin, zone_manager</w:t>
+              <w:t>reports.run</w:t>
             </w:r>
           </w:p>
         </w:tc>
@@ -8859,7 +9204,7 @@
               <w:rPr>
                 <w:sz w:val="18"/>
               </w:rPr>
-              <w:t>admin</w:t>
+              <w:t>system.operate</w:t>
             </w:r>
           </w:p>
         </w:tc>
@@ -8917,7 +9262,7 @@
               <w:rPr>
                 <w:sz w:val="18"/>
               </w:rPr>
-              <w:t>admin</w:t>
+              <w:t>system.operate</w:t>
             </w:r>
           </w:p>
         </w:tc>
@@ -8975,7 +9320,7 @@
               <w:rPr>
                 <w:sz w:val="18"/>
               </w:rPr>
-              <w:t>admin</w:t>
+              <w:t>system.operate</w:t>
             </w:r>
           </w:p>
         </w:tc>
@@ -9033,7 +9378,7 @@
               <w:rPr>
                 <w:sz w:val="18"/>
               </w:rPr>
-              <w:t>admin</w:t>
+              <w:t>system.operate</w:t>
             </w:r>
           </w:p>
         </w:tc>
@@ -9091,7 +9436,7 @@
               <w:rPr>
                 <w:sz w:val="18"/>
               </w:rPr>
-              <w:t>admin</w:t>
+              <w:t>system.operate</w:t>
             </w:r>
           </w:p>
         </w:tc>
@@ -9149,7 +9494,7 @@
               <w:rPr>
                 <w:sz w:val="18"/>
               </w:rPr>
-              <w:t>admin, zone_manager</w:t>
+              <w:t>config.manage</w:t>
             </w:r>
           </w:p>
         </w:tc>
@@ -9207,7 +9552,7 @@
               <w:rPr>
                 <w:sz w:val="18"/>
               </w:rPr>
-              <w:t>admin, zone_manager</w:t>
+              <w:t>config.manage</w:t>
             </w:r>
           </w:p>
         </w:tc>
@@ -9265,7 +9610,7 @@
               <w:rPr>
                 <w:sz w:val="18"/>
               </w:rPr>
-              <w:t>admin, zone_manager</w:t>
+              <w:t>config.manage</w:t>
             </w:r>
           </w:p>
         </w:tc>
@@ -9323,7 +9668,7 @@
               <w:rPr>
                 <w:sz w:val="18"/>
               </w:rPr>
-              <w:t>admin, zone_manager</w:t>
+              <w:t>config.manage</w:t>
             </w:r>
           </w:p>
         </w:tc>
@@ -9381,7 +9726,7 @@
               <w:rPr>
                 <w:sz w:val="18"/>
               </w:rPr>
-              <w:t>admin, zone_manager</w:t>
+              <w:t>config.manage</w:t>
             </w:r>
           </w:p>
         </w:tc>
@@ -9439,7 +9784,7 @@
               <w:rPr>
                 <w:sz w:val="18"/>
               </w:rPr>
-              <w:t>admin, zone_manager</w:t>
+              <w:t>config.manage</w:t>
             </w:r>
           </w:p>
         </w:tc>
@@ -9497,7 +9842,7 @@
               <w:rPr>
                 <w:sz w:val="18"/>
               </w:rPr>
-              <w:t>admin, zone_manager</w:t>
+              <w:t>config.manage</w:t>
             </w:r>
           </w:p>
         </w:tc>
@@ -9555,7 +9900,7 @@
               <w:rPr>
                 <w:sz w:val="18"/>
               </w:rPr>
-              <w:t>admin, zone_manager</w:t>
+              <w:t>config.manage</w:t>
             </w:r>
           </w:p>
         </w:tc>
@@ -9613,7 +9958,7 @@
               <w:rPr>
                 <w:sz w:val="18"/>
               </w:rPr>
-              <w:t>admin, zone_manager</w:t>
+              <w:t>config.manage</w:t>
             </w:r>
           </w:p>
         </w:tc>
@@ -9653,7 +9998,7 @@
                 <w:color w:val="6F5900"/>
                 <w:sz w:val="18"/>
               </w:rPr>
-              <w:t>/internal/admin/settings/email/gmail/callback</w:t>
+              <w:t>/internal/admin/settings</w:t>
             </w:r>
           </w:p>
         </w:tc>
@@ -9671,7 +10016,7 @@
               <w:rPr>
                 <w:sz w:val="18"/>
               </w:rPr>
-              <w:t>any signed-in</w:t>
+              <w:t>instance.administer</w:t>
             </w:r>
           </w:p>
         </w:tc>
@@ -9691,7 +10036,7 @@
               <w:rPr>
                 <w:sz w:val="18"/>
               </w:rPr>
-              <w:t>GET</w:t>
+              <w:t>PUT</w:t>
             </w:r>
           </w:p>
         </w:tc>
@@ -9729,7 +10074,7 @@
               <w:rPr>
                 <w:sz w:val="18"/>
               </w:rPr>
-              <w:t>super_admin</w:t>
+              <w:t>instance.administer</w:t>
             </w:r>
           </w:p>
         </w:tc>
@@ -9749,7 +10094,7 @@
               <w:rPr>
                 <w:sz w:val="18"/>
               </w:rPr>
-              <w:t>PUT</w:t>
+              <w:t>POST</w:t>
             </w:r>
           </w:p>
         </w:tc>
@@ -9769,7 +10114,7 @@
                 <w:color w:val="6F5900"/>
                 <w:sz w:val="18"/>
               </w:rPr>
-              <w:t>/internal/admin/settings</w:t>
+              <w:t>/internal/admin/settings/email/verify</w:t>
             </w:r>
           </w:p>
         </w:tc>
@@ -9787,7 +10132,7 @@
               <w:rPr>
                 <w:sz w:val="18"/>
               </w:rPr>
-              <w:t>super_admin</w:t>
+              <w:t>instance.administer</w:t>
             </w:r>
           </w:p>
         </w:tc>
@@ -9827,7 +10172,7 @@
                 <w:color w:val="6F5900"/>
                 <w:sz w:val="18"/>
               </w:rPr>
-              <w:t>/internal/admin/settings/email/verify</w:t>
+              <w:t>/internal/admin/settings/email/diagnose</w:t>
             </w:r>
           </w:p>
         </w:tc>
@@ -9845,7 +10190,7 @@
               <w:rPr>
                 <w:sz w:val="18"/>
               </w:rPr>
-              <w:t>super_admin</w:t>
+              <w:t>instance.administer</w:t>
             </w:r>
           </w:p>
         </w:tc>
@@ -9885,7 +10230,7 @@
                 <w:color w:val="6F5900"/>
                 <w:sz w:val="18"/>
               </w:rPr>
-              <w:t>/internal/admin/settings/email/diagnose</w:t>
+              <w:t>/internal/admin/settings/email/test-send</w:t>
             </w:r>
           </w:p>
         </w:tc>
@@ -9903,181 +10248,7 @@
               <w:rPr>
                 <w:sz w:val="18"/>
               </w:rPr>
-              <w:t>super_admin</w:t>
-            </w:r>
-          </w:p>
-        </w:tc>
-      </w:tr>
-      <w:tr>
-        <w:tc>
-          <w:tcPr>
-            <w:tcW w:type="dxa" w:w="1152"/>
-          </w:tcPr>
-          <w:p>
-            <w:r>
-              <w:rPr>
-                <w:sz w:val="18"/>
-              </w:rPr>
-            </w:r>
-            <w:r>
-              <w:rPr>
-                <w:sz w:val="18"/>
-              </w:rPr>
-              <w:t>POST</w:t>
-            </w:r>
-          </w:p>
-        </w:tc>
-        <w:tc>
-          <w:tcPr>
-            <w:tcW w:type="dxa" w:w="4608"/>
-          </w:tcPr>
-          <w:p>
-            <w:r>
-              <w:rPr>
-                <w:sz w:val="18"/>
-              </w:rPr>
-            </w:r>
-            <w:r>
-              <w:rPr>
-                <w:rFonts w:ascii="Consolas" w:hAnsi="Consolas"/>
-                <w:color w:val="6F5900"/>
-                <w:sz w:val="18"/>
-              </w:rPr>
-              <w:t>/internal/admin/settings/email/gmail/authorize</w:t>
-            </w:r>
-          </w:p>
-        </w:tc>
-        <w:tc>
-          <w:tcPr>
-            <w:tcW w:type="dxa" w:w="3456"/>
-          </w:tcPr>
-          <w:p>
-            <w:r>
-              <w:rPr>
-                <w:sz w:val="18"/>
-              </w:rPr>
-            </w:r>
-            <w:r>
-              <w:rPr>
-                <w:sz w:val="18"/>
-              </w:rPr>
-              <w:t>super_admin</w:t>
-            </w:r>
-          </w:p>
-        </w:tc>
-      </w:tr>
-      <w:tr>
-        <w:tc>
-          <w:tcPr>
-            <w:tcW w:type="dxa" w:w="1152"/>
-          </w:tcPr>
-          <w:p>
-            <w:r>
-              <w:rPr>
-                <w:sz w:val="18"/>
-              </w:rPr>
-            </w:r>
-            <w:r>
-              <w:rPr>
-                <w:sz w:val="18"/>
-              </w:rPr>
-              <w:t>GET</w:t>
-            </w:r>
-          </w:p>
-        </w:tc>
-        <w:tc>
-          <w:tcPr>
-            <w:tcW w:type="dxa" w:w="4608"/>
-          </w:tcPr>
-          <w:p>
-            <w:r>
-              <w:rPr>
-                <w:sz w:val="18"/>
-              </w:rPr>
-            </w:r>
-            <w:r>
-              <w:rPr>
-                <w:rFonts w:ascii="Consolas" w:hAnsi="Consolas"/>
-                <w:color w:val="6F5900"/>
-                <w:sz w:val="18"/>
-              </w:rPr>
-              <w:t>/internal/admin/settings/email/gmail/redirect-uri</w:t>
-            </w:r>
-          </w:p>
-        </w:tc>
-        <w:tc>
-          <w:tcPr>
-            <w:tcW w:type="dxa" w:w="3456"/>
-          </w:tcPr>
-          <w:p>
-            <w:r>
-              <w:rPr>
-                <w:sz w:val="18"/>
-              </w:rPr>
-            </w:r>
-            <w:r>
-              <w:rPr>
-                <w:sz w:val="18"/>
-              </w:rPr>
-              <w:t>super_admin</w:t>
-            </w:r>
-          </w:p>
-        </w:tc>
-      </w:tr>
-      <w:tr>
-        <w:tc>
-          <w:tcPr>
-            <w:tcW w:type="dxa" w:w="1152"/>
-          </w:tcPr>
-          <w:p>
-            <w:r>
-              <w:rPr>
-                <w:sz w:val="18"/>
-              </w:rPr>
-            </w:r>
-            <w:r>
-              <w:rPr>
-                <w:sz w:val="18"/>
-              </w:rPr>
-              <w:t>POST</w:t>
-            </w:r>
-          </w:p>
-        </w:tc>
-        <w:tc>
-          <w:tcPr>
-            <w:tcW w:type="dxa" w:w="4608"/>
-          </w:tcPr>
-          <w:p>
-            <w:r>
-              <w:rPr>
-                <w:sz w:val="18"/>
-              </w:rPr>
-            </w:r>
-            <w:r>
-              <w:rPr>
-                <w:rFonts w:ascii="Consolas" w:hAnsi="Consolas"/>
-                <w:color w:val="6F5900"/>
-                <w:sz w:val="18"/>
-              </w:rPr>
-              <w:t>/internal/admin/settings/email/test-send</w:t>
-            </w:r>
-          </w:p>
-        </w:tc>
-        <w:tc>
-          <w:tcPr>
-            <w:tcW w:type="dxa" w:w="3456"/>
-          </w:tcPr>
-          <w:p>
-            <w:r>
-              <w:rPr>
-                <w:sz w:val="18"/>
-              </w:rPr>
-            </w:r>
-            <w:r>
-              <w:rPr>
-                <w:sz w:val="18"/>
-              </w:rPr>
-              <w:t>super_admin</w:t>
+              <w:t>instance.administer</w:t>
             </w:r>
           </w:p>
         </w:tc>
@@ -10766,7 +10937,7 @@
               <w:rPr>
                 <w:sz w:val="18"/>
               </w:rPr>
-              <w:t>Template rendering and the role ladder</w:t>
+              <w:t>Template rendering, the permission table, and role assignment</w:t>
             </w:r>
           </w:p>
         </w:tc>
@@ -12005,7 +12176,7 @@
           <w:color w:val="6F5900"/>
           <w:sz w:val="18"/>
         </w:rPr>
-        <w:t>SessionUser</w:t>
+        <w:t>Role</w:t>
       </w:r>
       <w:r>
         <w:t xml:space="preserve"> union and to </w:t>
@@ -12016,7 +12187,7 @@
           <w:color w:val="6F5900"/>
           <w:sz w:val="18"/>
         </w:rPr>
-        <w:t>RANK</w:t>
+        <w:t>ROLE_PERMISSIONS</w:t>
       </w:r>
       <w:r>
         <w:t xml:space="preserve"> in </w:t>
@@ -12027,10 +12198,10 @@
           <w:color w:val="6F5900"/>
           <w:sz w:val="18"/>
         </w:rPr>
-        <w:t>auth.guard.ts</w:t>
-      </w:r>
-      <w:r>
-        <w:t>, or leave it off the ladder if it should not inherit.</w:t>
+        <w:t>permissions.ts</w:t>
+      </w:r>
+      <w:r>
+        <w:t>, listing every permission it holds -- nothing is inherited by rank.</w:t>
       </w:r>
     </w:p>
     <w:p>
@@ -12038,7 +12209,7 @@
         <w:pStyle w:val="ListNumber"/>
       </w:pPr>
       <w:r>
-        <w:t xml:space="preserve">Extend </w:t>
+        <w:t xml:space="preserve">If its session should see every zone rather than one, add it to </w:t>
       </w:r>
       <w:r>
         <w:rPr>
@@ -12046,10 +12217,51 @@
           <w:color w:val="6F5900"/>
           <w:sz w:val="18"/>
         </w:rPr>
-        <w:t>auth.guard.spec.ts</w:t>
-      </w:r>
-      <w:r>
-        <w:t xml:space="preserve"> first; the ladder is security-critical and the tests are the specification.</w:t>
+        <w:t>ZONE_WIDE_ROLES</w:t>
+      </w:r>
+      <w:r>
+        <w:t xml:space="preserve"> in the same file: </w:t>
+      </w:r>
+      <w:r>
+        <w:rPr>
+          <w:rFonts w:ascii="Consolas" w:hAnsi="Consolas"/>
+          <w:color w:val="6F5900"/>
+          <w:sz w:val="18"/>
+        </w:rPr>
+        <w:t>zoneContextFor</w:t>
+      </w:r>
+      <w:r>
+        <w:t xml:space="preserve"> and </w:t>
+      </w:r>
+      <w:r>
+        <w:rPr>
+          <w:rFonts w:ascii="Consolas" w:hAnsi="Consolas"/>
+          <w:color w:val="6F5900"/>
+          <w:sz w:val="18"/>
+        </w:rPr>
+        <w:t>canAssignRole</w:t>
+      </w:r>
+      <w:r>
+        <w:t xml:space="preserve"> both read that list, so a zone manager cannot mint the new role by accident.</w:t>
+      </w:r>
+    </w:p>
+    <w:p>
+      <w:pPr>
+        <w:pStyle w:val="ListNumber"/>
+      </w:pPr>
+      <w:r>
+        <w:t xml:space="preserve">Extend </w:t>
+      </w:r>
+      <w:r>
+        <w:rPr>
+          <w:rFonts w:ascii="Consolas" w:hAnsi="Consolas"/>
+          <w:color w:val="6F5900"/>
+          <w:sz w:val="18"/>
+        </w:rPr>
+        <w:t>permissions.spec.ts</w:t>
+      </w:r>
+      <w:r>
+        <w:t xml:space="preserve"> first; the table is security-critical and the tests are the specification.</w:t>
       </w:r>
     </w:p>
     <w:p>
@@ -12079,7 +12291,18 @@
         <w:t>admin-users.controller.ts</w:t>
       </w:r>
       <w:r>
-        <w:t xml:space="preserve"> and to the console's nav guards.</w:t>
+        <w:t xml:space="preserve">, to the write arrays in </w:t>
+      </w:r>
+      <w:r>
+        <w:rPr>
+          <w:rFonts w:ascii="Consolas" w:hAnsi="Consolas"/>
+          <w:color w:val="6F5900"/>
+          <w:sz w:val="18"/>
+        </w:rPr>
+        <w:t>0013_role-matrix.sql</w:t>
+      </w:r>
+      <w:r>
+        <w:t>, and to the console's nav guards.</w:t>
       </w:r>
     </w:p>
     <w:p>

</xml_diff>